<commit_message>
Add evaluation measures, queue caveat and limitations
Co-Authored-By: Claude Opus 5.5 <noreply@anthropic.com>
Claude-Session: https://claude.ai/code/session_01A6YqZ3CemdNRDWpne7Qgu9
</commit_message>
<xml_diff>
--- a/report/Report_EDA_Optimising_NYC_Taxis_Ishan_Ghosh.docx
+++ b/report/Report_EDA_Optimising_NYC_Taxis_Ishan_Ghosh.docx
@@ -154,6 +154,18 @@
       </w:r>
       <w:r>
         <w:t xml:space="preserve"> leaves out trips that start and end in the same zone and trips longer than 180 minutes; route averages need at least 10 sampled trips.</w:t>
+      </w:r>
+    </w:p>
+    <w:p>
+      <w:pPr/>
+      <w:r>
+        <w:rPr>
+          <w:b/>
+        </w:rPr>
+        <w:t>Limitations:</w:t>
+      </w:r>
+      <w:r>
+        <w:t xml:space="preserve"> all figures are estimates scaled up from a 0.75% sample of the trips kept after cleaning, so small groups (rare routes, small zones, the Myle vendor) are less reliable. Filling missing values with the mode and removing outliers can slightly shift averages, and trip records show completed trips only, not unmet demand or waiting times.</w:t>
       </w:r>
     </w:p>
     <w:p>
@@ -3913,7 +3925,7 @@
         <w:t>Run the airports as dedicated queues.</w:t>
       </w:r>
       <w:r>
-        <w:t xml:space="preserve"> JFK is the busiest pickup zone (about 225 pickups an hour) and both airports have far more pickups than dropoffs (JFK 4.3×, LaGuardia 2.5×), so they need a steady supply of cabs fed from nearby Queens dropoffs.</w:t>
+        <w:t xml:space="preserve"> JFK is the busiest pickup zone (about 225 pickups an hour) and both airports have far more pickups than dropoffs (JFK 4.3×, LaGuardia 2.5×), so they need a steady supply of cabs fed from nearby Queens dropoffs. Trip records do not show queue lengths, so the number of cabs sent should follow live waiting times.</w:t>
       </w:r>
     </w:p>
     <w:p>
@@ -3928,6 +3940,20 @@
       </w:r>
       <w:r>
         <w:t xml:space="preserve"> Daily demand is lowest in July–September and highest in May and October: schedule leave and maintenance in summer and run a full fleet in spring and Q4.</w:t>
+      </w:r>
+    </w:p>
+    <w:p>
+      <w:pPr>
+        <w:spacing w:after="120"/>
+      </w:pPr>
+      <w:r>
+        <w:rPr>
+          <w:b/>
+        </w:rPr>
+        <w:t>Measure the effect.</w:t>
+      </w:r>
+      <w:r>
+        <w:t xml:space="preserve"> Track passenger waiting time, completed trips per cab per hour and empty miles before and after each change to confirm it improves operations.</w:t>
       </w:r>
     </w:p>
     <w:p>

</xml_diff>